<commit_message>
Updated and added some blogs
</commit_message>
<xml_diff>
--- a/res/yw/20250214_1.docx
+++ b/res/yw/20250214_1.docx
@@ -30,89 +30,8 @@
           <w:lang w:val="en-US" w:eastAsia="zh-CN"/>
         </w:rPr>
       </w:pPr>
-      <w:r>
-        <w:rPr>
-          <w:sz w:val="42"/>
-        </w:rPr>
-        <mc:AlternateContent>
-          <mc:Choice Requires="wpg">
-            <w:drawing>
-              <wp:anchor distT="0" distB="0" distL="114300" distR="114300" simplePos="0" relativeHeight="251659264" behindDoc="1" locked="0" layoutInCell="1" allowOverlap="1">
-                <wp:simplePos x="0" y="0"/>
-                <wp:positionH relativeFrom="column">
-                  <wp:posOffset>-359410</wp:posOffset>
-                </wp:positionH>
-                <wp:positionV relativeFrom="paragraph">
-                  <wp:posOffset>-584200</wp:posOffset>
-                </wp:positionV>
-                <wp:extent cx="6222365" cy="10319385"/>
-                <wp:effectExtent l="114300" t="171450" r="121285" b="215265"/>
-                <wp:wrapNone/>
-                <wp:docPr id="4" name="组合 4"/>
-                <wp:cNvGraphicFramePr/>
-                <a:graphic xmlns:a="http://schemas.openxmlformats.org/drawingml/2006/main">
-                  <a:graphicData uri="http://schemas.microsoft.com/office/word/2010/wordprocessingGroup">
-                    <wpg:wgp>
-                      <wpg:cNvGrpSpPr/>
-                      <wpg:grpSpPr>
-                        <a:xfrm>
-                          <a:off x="0" y="0"/>
-                          <a:ext cx="6222365" cy="10319385"/>
-                          <a:chOff x="10008" y="12594"/>
-                          <a:chExt cx="684" cy="1602"/>
-                        </a:xfrm>
-                      </wpg:grpSpPr>
-                      <mc:AlternateContent xmlns:a14="http://schemas.microsoft.com/office/drawing/2010/main">
-                        <mc:Choice Requires="a14">
-                          <w14:contentPart bwMode="clr" r:id="rId6">
-                            <w14:nvContentPartPr>
-                              <w14:cNvPr id="1" name="墨迹 1"/>
-                              <w14:cNvContentPartPr/>
-                            </w14:nvContentPartPr>
-                            <w14:xfrm>
-                              <a:off x="10008" y="12594"/>
-                              <a:ext cx="685" cy="1245"/>
-                            </w14:xfrm>
-                          </w14:contentPart>
-                        </mc:Choice>
-                      </mc:AlternateContent>
-                      <mc:AlternateContent xmlns:a14="http://schemas.microsoft.com/office/drawing/2010/main">
-                        <mc:Choice Requires="a14">
-                          <w14:contentPart bwMode="clr" r:id="rId7">
-                            <w14:nvContentPartPr>
-                              <w14:cNvPr id="2" name="墨迹 2"/>
-                              <w14:cNvContentPartPr/>
-                            </w14:nvContentPartPr>
-                            <w14:xfrm>
-                              <a:off x="10350" y="14120"/>
-                              <a:ext cx="59" cy="76"/>
-                            </w14:xfrm>
-                          </w14:contentPart>
-                        </mc:Choice>
-                      </mc:AlternateContent>
-                    </wpg:wgp>
-                  </a:graphicData>
-                </a:graphic>
-              </wp:anchor>
-            </w:drawing>
-          </mc:Choice>
-          <mc:Fallback>
-            <w:pict>
-              <v:group id="_x0000_s1026" o:spid="_x0000_s1026" o:spt="203" style="position:absolute;left:0pt;margin-left:-28.3pt;margin-top:-46pt;height:812.55pt;width:489.95pt;z-index:-251657216;mso-width-relative:page;mso-height-relative:page;" coordorigin="10008,12594" coordsize="684,1602" o:gfxdata="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">
-                <o:lock v:ext="edit" aspectratio="f"/>
-                <v:shape id="_x0000_s1026" o:spid="_x0000_s1026" o:spt="75" style="position:absolute;left:9995;top:12559;height:1315;width:709;" coordsize="21600,21600" o:gfxdata="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">
-                  <v:imagedata r:id="rId8" o:title=""/>
-                  <o:lock v:ext="edit"/>
-                </v:shape>
-                <v:shape id="_x0000_s1026" o:spid="_x0000_s1026" o:spt="75" style="position:absolute;left:10337;top:14085;height:146;width:83;" coordsize="21600,21600" o:gfxdata="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">
-                  <v:imagedata r:id="rId9" o:title=""/>
-                  <o:lock v:ext="edit"/>
-                </v:shape>
-              </v:group>
-            </w:pict>
-          </mc:Fallback>
-        </mc:AlternateContent>
-      </w:r>
+      <w:bookmarkStart w:id="0" w:name="_GoBack"/>
+      <w:bookmarkEnd w:id="0"/>
       <w:r>
         <w:rPr>
           <w:rFonts w:hint="eastAsia"/>
@@ -269,8 +188,6 @@
         </w:rPr>
         <w:t>以谦卑的态度认世界，可以知道宇宙的广阔和自身的渺小</w:t>
       </w:r>
-      <w:bookmarkStart w:id="0" w:name="_GoBack"/>
-      <w:bookmarkEnd w:id="0"/>
     </w:p>
     <w:sectPr>
       <w:headerReference r:id="rId3" w:type="default"/>
@@ -305,7 +222,7 @@
       <mc:AlternateContent>
         <mc:Choice Requires="wps">
           <w:drawing>
-            <wp:anchor distT="0" distB="0" distL="114300" distR="114300" simplePos="0" relativeHeight="251660288" behindDoc="0" locked="0" layoutInCell="1" allowOverlap="1">
+            <wp:anchor distT="0" distB="0" distL="114300" distR="114300" simplePos="0" relativeHeight="251659264" behindDoc="0" locked="0" layoutInCell="1" allowOverlap="1">
               <wp:simplePos x="0" y="0"/>
               <wp:positionH relativeFrom="margin">
                 <wp:align>center</wp:align>
@@ -402,7 +319,7 @@
         </mc:Choice>
         <mc:Fallback>
           <w:pict>
-            <v:shape id="_x0000_s1026" o:spid="_x0000_s1026" o:spt="202" type="#_x0000_t202" style="position:absolute;left:0pt;margin-top:0pt;height:144pt;width:144pt;mso-position-horizontal:center;mso-position-horizontal-relative:margin;mso-wrap-style:none;z-index:251660288;mso-width-relative:page;mso-height-relative:page;" filled="f" stroked="f" coordsize="21600,21600" o:gfxdata="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">
+            <v:shape id="_x0000_s1026" o:spid="_x0000_s1026" o:spt="202" type="#_x0000_t202" style="position:absolute;left:0pt;margin-top:0pt;height:144pt;width:144pt;mso-position-horizontal:center;mso-position-horizontal-relative:margin;mso-wrap-style:none;z-index:251659264;mso-width-relative:page;mso-height-relative:page;" filled="f" stroked="f" coordsize="21600,21600" o:gfxdata="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">
               <v:fill on="f" focussize="0,0"/>
               <v:stroke on="f" weight="0.5pt"/>
               <v:imagedata o:title=""/>
@@ -997,66 +914,6 @@
 </w:styles>
 </file>
 
-<file path=word/ink/ink1.xml><?xml version="1.0" encoding="utf-8"?>
-<inkml:ink xmlns:inkml="http://www.w3.org/2003/InkML">
-  <inkml:definitions>
-    <inkml:context xml:id="ctx0">
-      <inkml:inkSource xml:id="inkSrc0">
-        <inkml:traceFormat>
-          <inkml:channel name="X" type="integer" units="cm"/>
-          <inkml:channel name="Y" type="integer" units="cm"/>
-          <inkml:channel name="F" type="integer" max="1023" units="dev"/>
-        </inkml:traceFormat>
-        <inkml:channelProperties>
-          <inkml:channelProperty channel="X" name="resolution" value="28.3464566929134" units="1/cm"/>
-          <inkml:channelProperty channel="Y" name="resolution" value="28.3464566929134" units="1/cm"/>
-          <inkml:channelProperty channel="F" name="resolution" value="0" units="1/dev"/>
-        </inkml:channelProperties>
-      </inkml:inkSource>
-      <inkml:timestamp xml:id="ts0" timeString="2025-02-13T16:24:26"/>
-    </inkml:context>
-    <inkml:brush xml:id="br0">
-      <inkml:brushProperty name="width" value="0.635" units="cm"/>
-      <inkml:brushProperty name="height" value="1.27" units="cm"/>
-      <inkml:brushProperty name="color" value="#000000"/>
-      <inkml:brushProperty name="transparency" value="232"/>
-      <inkml:brushProperty name="ignorePressure" value="0"/>
-    </inkml:brush>
-  </inkml:definitions>
-  <inkml:trace contextRef="#ctx0" brushRef="#br0">10008.000 12704.000 767,'6.810'-1.367'0,"-1.466"-1.368"-4,-0.447-1.468 2,0.475-2.248 2,1.873-1.102-2,1.310 0.235 0,-0.521 1.505 1,-1.003 0.918 0,-0.879 0.964 1,0.480 0.977 1,4.181 1.030 3,-3.369 1.308-6,0.348 0.194 0,0.163 0.142 0,-0.162 0.113 0,0.143-0.104 0,-0.643-0.236 0,-0.723-0.316 1,4.386-1.558 5,1.100-1.766 0,-4.359 1.163-4,-2.093 0.814 0,5.106-1.795-1,-1.104-0.156-1,-0.913-1.335 2,-0.855-0.921 3,0.627-1.207-3,-0.454 0.884 0,-0.812 1.765 0,-0.891 1.693 1,-0.063 1.168-1,1.437 0.923 3,2.721 0.646-4,-0.651 0.490-1,-1.187 0.201 1,-0.716 0.080 2,-1.689-0.024 0,1.485 0.007 1,2.204-0.160-3,3.385-0.051-1,-4.726-0.027 0,1.193-0.005 0,0.976-0.004 0,0.411-0.002 0,0.131-0.002 0,-1.049-0.001 0,-0.344 0.000 0,-0.440 0.000 0,0.355 0.000 3,-0.372 0.000 0,-0.313 0.000 0,-0.756 0.001 1,-0.740 0.000 0,-0.809 0.001-2,4.472-0.001 1,-2.569 0.002 2,-0.989 0.001 2,-1.207 0.221-2,0.390 1.314-1,1.717 3.442-4,-3.800-0.822 1,3.489 3.250 0,1.120 0.045-1,-3.965-3.555 1,-0.107-0.174 0,-0.240-0.183 0,3.441 2.220 1,1.100 0.384 2,-0.212-0.135-1,-1.991-1.004-1,-2.226-0.558 0,-0.306 2.663 3,-1.337-1.754 0,1.317 1.729-4,2.189 2.986-1,-2.924-4.613 1,0.808 0.786-1,-0.054-0.269 1,-0.218-0.414 0,-0.529-0.589 0,-0.235-0.128 1,-0.216-0.046 1,1.707 3.672 0,-1.271 0.562 0,-0.439-1.181 0,-0.532-1.699 0,0.178 1.040 1,0.419-0.161 0,-0.782-1.053-3,1.888 0.005 1,0.081-0.754-1,-0.900-0.265 0,1.634 2.748 2,-2.201-0.648-1,-0.923 1.334-1,-1.081-0.354 0,-0.784-0.785 2,-0.470-0.099 0,-0.213 0.027-1,-0.100 0.450 2,-0.028 1.747-5,0.020 2.896 3,0.085-6.222-1,-0.017 5.224-1,0.032-2.833 0,0.018-1.032 5,0.010 0.115 0,0.006 3.526-4,0.000-4.673 0,0.001 3.150 0,-0.251-0.589 0,-1.607-0.779 0,-1.814-0.798 4,-2.247 0.529-4,-1.628 1.372 2,3.843-4.521-1,-0.243 0.482-1,-0.282 0.537 0,-0.086 0.053 0,-0.324 0.254 0,-0.320 0.178 1,-0.298 0.117-1,-0.498 0.344 0,-0.111-0.096 0,-0.032-0.156 0,-0.397 0.725 0,0.050 0.528 1,0.079 0.629 1,0.091 0.135-1,0.090-0.181-1,0.082-0.359 1,1.390-2.092-1,-0.242 0.042 1,-0.340 0.145 1,-0.723 0.604 0,-0.178 0.016-2,-0.086-0.045 1,-0.339 0.221 0,0.305-0.458-1,0.402-0.542 1,0.292-0.370 0,0.199-0.233 0,0.125-0.126 3,0.404-0.405-2,-0.026 0.025 0,-0.070 0.070-1,-1.001 1.000 0,0.326-0.326 0,0.435-0.436 0,-2.811 2.731 0,1.217-1.323 2,0.863-0.770 0,-0.395 0.521-1,-0.050 0.065-1,0.148-0.315 2,0.966-0.915-3,-0.604 0.248 1,-1.826-0.854-1,1.248-1.555 1,-0.578 1.086 0,0.106-0.058 4,1.859 0.916-4,4.359 1.214-1,-2.035 0.299 2,-4.488-2.994 1,1.941-0.167-4,0.306 0.876 1,-1.309 2.359 0,1.201 0.321 1,2.536-0.308 1,-0.484-0.435 1,0.267-0.517-2,1.165 0.498-1,0.313 1.759-1,-0.432 1.171 1,-0.634 2.038-2,0.205-0.001 2,0.362 0.008 1,0.622-2.108 0,-0.301-2.010 2,-1.506 0.704-1,-1.863 2.284-1,0.633-1.067-1,1.553-2.434 1,0.411 1.656 2,1.407 0.694 0,0.667-0.885-3,0.106-0.988 0,0.020 0.485 3,-0.013 0.360-3,-0.035-0.787 0,-0.034-0.689 1,-0.022 1.083 2,-0.031 1.065-1,-0.009-1.150-2,0.001-1.090 1,0.003 1.495 0,0.002-0.482 1,0.001-0.929-1,0.000 0.844 0,0.000-0.566-1,0.000 2.861 0,0.000-3.104 2,0.000 1.046-1,0.000 1.489 1,0.000-1.053-1,0.000 1.459-1,0.000 0.916-2,0.000 0.170 2,0.000-1.057-1,0.000 0.311 2,0.000 0.827 2,0.000-1.582-1,0.000-1.479-2,0.000 1.403 2,0.000 0.717 1,0.000-2.682-2,0.000 0.934 0,0.000-0.858 0,0.000-0.146 2,0.000 0.422-2,0.000 0.578 1,0.000-1.376-1,0.000 2.178-1,0.000-0.118 1,0.000 0.409-2,0.000 0.349 0,0.000-1.423 1,0.000-1.322 2,0.000 1.949 1,0.000-0.513 0,0.000-0.060-3,0.000 0.557 1,0.000-1.294 0,0.000-0.234-1,0.000 0.553 0,0.000-1.087 1,0.000 0.093 1</inkml:trace>
-</inkml:ink>
-</file>
-
-<file path=word/ink/ink2.xml><?xml version="1.0" encoding="utf-8"?>
-<inkml:ink xmlns:inkml="http://www.w3.org/2003/InkML">
-  <inkml:definitions>
-    <inkml:context xml:id="ctx0">
-      <inkml:inkSource xml:id="inkSrc0">
-        <inkml:traceFormat>
-          <inkml:channel name="X" type="integer" units="cm"/>
-          <inkml:channel name="Y" type="integer" units="cm"/>
-          <inkml:channel name="F" type="integer" max="1023" units="dev"/>
-        </inkml:traceFormat>
-        <inkml:channelProperties>
-          <inkml:channelProperty channel="X" name="resolution" value="28.3464566929134" units="1/cm"/>
-          <inkml:channelProperty channel="Y" name="resolution" value="28.3464566929134" units="1/cm"/>
-          <inkml:channelProperty channel="F" name="resolution" value="0" units="1/dev"/>
-        </inkml:channelProperties>
-      </inkml:inkSource>
-      <inkml:timestamp xml:id="ts0" timeString="2025-02-13T16:24:29"/>
-    </inkml:context>
-    <inkml:brush xml:id="br0">
-      <inkml:brushProperty name="width" value="0.635" units="cm"/>
-      <inkml:brushProperty name="height" value="1.27" units="cm"/>
-      <inkml:brushProperty name="color" value="#000000"/>
-      <inkml:brushProperty name="transparency" value="232"/>
-      <inkml:brushProperty name="ignorePressure" value="0"/>
-    </inkml:brush>
-  </inkml:definitions>
-  <inkml:trace contextRef="#ctx0" brushRef="#br0">10375.000 14129.000 767,'-5.350'-2.832'0,"-0.376"-0.199"0,0.262 0.216 0,-0.728 2.495-5,3.873 6.246 7,2.350 0.094-3,-0.015 1.667 0,-0.015 0.714 0,-0.002-0.688 0,0.000-1.060 1,0.000 0.510 1,0.000-0.673 0,0.099 0.177-1,1.893-0.994 0,3.478-0.534-1,2.098-3.604 1,-0.031-1.305-1,-1.127-0.313 2,-0.292-0.096 0,0.471 0.160-1,-0.382-0.105 0,-4.159-5.563 1,-2.075-1.232 0,1.246 0.016-2,1.217-1.651-1,-0.428-0.359 1,-0.623 1.781 0,-0.396 0.804 0,-1.008 0.220 1,0.016-0.248 4,0.009 0.179-3,-1.475 0.354-2,-4.776 5.885 3,0.015 0.128-3,2.941 4.887 1,1.545 0.712 0,-2.620-1.479 0,-0.921 0.983-1,1.071-0.980 0,-1.080 2.213 0,2.263-0.837 0,1.685 1.249 2,-1.727-1.082 2,-1.380-1.481-3</inkml:trace>
-</inkml:ink>
-</file>
-
 <file path=word/theme/theme1.xml><?xml version="1.0" encoding="utf-8"?>
 <a:theme xmlns:a="http://schemas.openxmlformats.org/drawingml/2006/main" name="WPS">
   <a:themeElements>

</xml_diff>